<commit_message>
api booking, api admin
</commit_message>
<xml_diff>
--- a/Document/MÔ TẢ YÊU CẦU HỆ THỐNG.docx
+++ b/Document/MÔ TẢ YÊU CẦU HỆ THỐNG.docx
@@ -82,7 +82,13 @@
         <w:t>Đối với quản trị viên:</w:t>
       </w:r>
       <w:r>
-        <w:t xml:space="preserve"> Cung cấp công cụ quản lý toàn diện từ thông tin phim, phòng chiếu, suất chiếu đến thống kê doanh thu.</w:t>
+        <w:t xml:space="preserve"> Cung cấp công cụ quản lý toàn diện từ thông tin phim, phòng chiếu, suất chiếu</w:t>
+      </w:r>
+      <w:r>
+        <w:t>, phiếu giảm giá</w:t>
+      </w:r>
+      <w:r>
+        <w:t xml:space="preserve"> đến thống kê doanh thu.</w:t>
       </w:r>
     </w:p>
     <w:p>
@@ -335,6 +341,27 @@
           <w:b/>
           <w:bCs/>
         </w:rPr>
+        <w:t>Quản lý mã khuyến mãi</w:t>
+      </w:r>
+    </w:p>
+    <w:p>
+      <w:pPr>
+        <w:pStyle w:val="ListParagraph"/>
+        <w:numPr>
+          <w:ilvl w:val="0"/>
+          <w:numId w:val="3"/>
+        </w:numPr>
+        <w:tabs>
+          <w:tab w:val="clear" w:pos="720"/>
+          <w:tab w:val="num" w:pos="1080"/>
+        </w:tabs>
+        <w:ind w:left="1080"/>
+      </w:pPr>
+      <w:r>
+        <w:rPr>
+          <w:b/>
+          <w:bCs/>
+        </w:rPr>
         <w:t>Thống kê:</w:t>
       </w:r>
       <w:r>
@@ -428,6 +455,7 @@
           <w:b/>
           <w:bCs/>
         </w:rPr>
+        <w:lastRenderedPageBreak/>
         <w:t>Server:</w:t>
       </w:r>
       <w:r>
@@ -439,7 +467,6 @@
         <w:pStyle w:val="Heading2"/>
       </w:pPr>
       <w:r>
-        <w:lastRenderedPageBreak/>
         <w:t>II. Tạo Database</w:t>
       </w:r>
     </w:p>
@@ -450,8 +477,16 @@
           <w:ilvl w:val="0"/>
           <w:numId w:val="6"/>
         </w:numPr>
-      </w:pPr>
-      <w:r>
+        <w:rPr>
+          <w:b/>
+          <w:bCs/>
+        </w:rPr>
+      </w:pPr>
+      <w:r>
+        <w:rPr>
+          <w:b/>
+          <w:bCs/>
+        </w:rPr>
         <w:t>Các bảng có trong hệ thống</w:t>
       </w:r>
     </w:p>
@@ -587,6 +622,18 @@
       <w:pPr>
         <w:pStyle w:val="ListParagraph"/>
         <w:numPr>
+          <w:ilvl w:val="0"/>
+          <w:numId w:val="12"/>
+        </w:numPr>
+      </w:pPr>
+      <w:r>
+        <w:t>created_at: thời gian đăng ký tài khoản</w:t>
+      </w:r>
+    </w:p>
+    <w:p>
+      <w:pPr>
+        <w:pStyle w:val="ListParagraph"/>
+        <w:numPr>
           <w:ilvl w:val="1"/>
           <w:numId w:val="6"/>
         </w:numPr>
@@ -788,6 +835,18 @@
         </w:numPr>
       </w:pPr>
       <w:r>
+        <w:t xml:space="preserve">duration: thời gian bộ phim  </w:t>
+      </w:r>
+    </w:p>
+    <w:p>
+      <w:pPr>
+        <w:pStyle w:val="ListParagraph"/>
+        <w:numPr>
+          <w:ilvl w:val="0"/>
+          <w:numId w:val="16"/>
+        </w:numPr>
+      </w:pPr>
+      <w:r>
         <w:t>release_date: Ngày phim chính thức khởi chiếu.</w:t>
       </w:r>
     </w:p>
@@ -800,6 +859,31 @@
         </w:numPr>
       </w:pPr>
       <w:r>
+        <w:t>poster_url: url của poster</w:t>
+      </w:r>
+    </w:p>
+    <w:p>
+      <w:pPr>
+        <w:pStyle w:val="ListParagraph"/>
+        <w:numPr>
+          <w:ilvl w:val="0"/>
+          <w:numId w:val="16"/>
+        </w:numPr>
+      </w:pPr>
+      <w:r>
+        <w:t>trailer_url: url của trailer</w:t>
+      </w:r>
+    </w:p>
+    <w:p>
+      <w:pPr>
+        <w:pStyle w:val="ListParagraph"/>
+        <w:numPr>
+          <w:ilvl w:val="0"/>
+          <w:numId w:val="16"/>
+        </w:numPr>
+      </w:pPr>
+      <w:r>
+        <w:lastRenderedPageBreak/>
         <w:t>status: Trạng thái của phim (Sử dụng Enum: NOW_SHOWING - Đang chiếu, COMING_SOON - Sắp chiếu, ENDED - Ngừng chiếu).</w:t>
       </w:r>
     </w:p>
@@ -849,7 +933,6 @@
         </w:numPr>
       </w:pPr>
       <w:r>
-        <w:lastRenderedPageBreak/>
         <w:t>room_id: Khóa ngoại liên kết với bảng rooms (Được chiếu ở phòng nào).</w:t>
       </w:r>
     </w:p>
@@ -923,7 +1006,7 @@
         </w:numPr>
       </w:pPr>
       <w:r>
-        <w:t>total_amount: Tổng số tiền gốc của đơn hàng (chưa tính giảm giá).</w:t>
+        <w:t>showtime_id: Khoá ngoại liên kết với bảng showtimes</w:t>
       </w:r>
     </w:p>
     <w:p>
@@ -936,6 +1019,54 @@
       </w:pPr>
       <w:r>
         <w:t>voucher_id: Khóa ngoại liên kết với bảng vouchers (Mã giảm giá đã được áp dụng cho đơn này, nếu không dùng mã thì để trống).</w:t>
+      </w:r>
+    </w:p>
+    <w:p>
+      <w:pPr>
+        <w:pStyle w:val="ListParagraph"/>
+        <w:numPr>
+          <w:ilvl w:val="0"/>
+          <w:numId w:val="18"/>
+        </w:numPr>
+      </w:pPr>
+      <w:r>
+        <w:t>total_price: Tổng số tiền gốc của đơn hàng (chưa tính giảm giá).</w:t>
+      </w:r>
+    </w:p>
+    <w:p>
+      <w:pPr>
+        <w:pStyle w:val="ListParagraph"/>
+        <w:numPr>
+          <w:ilvl w:val="0"/>
+          <w:numId w:val="18"/>
+        </w:numPr>
+      </w:pPr>
+      <w:r>
+        <w:t xml:space="preserve">status: trạng thái đặt vé (Enum: </w:t>
+      </w:r>
+      <w:r>
+        <w:t>PENDIN</w:t>
+      </w:r>
+      <w:r>
+        <w:t xml:space="preserve">G (đang giữ ghế); </w:t>
+      </w:r>
+      <w:r>
+        <w:t xml:space="preserve">CONFIRMED </w:t>
+      </w:r>
+      <w:r>
+        <w:t>(</w:t>
+      </w:r>
+      <w:r>
+        <w:t>đã thanh toán thành công</w:t>
+      </w:r>
+      <w:r>
+        <w:t>);</w:t>
+      </w:r>
+      <w:r>
+        <w:t xml:space="preserve"> CANCELLED</w:t>
+      </w:r>
+      <w:r>
+        <w:t xml:space="preserve"> (bị huỷ)</w:t>
       </w:r>
     </w:p>
     <w:p>
@@ -1027,6 +1158,18 @@
       <w:pPr>
         <w:pStyle w:val="ListParagraph"/>
         <w:numPr>
+          <w:ilvl w:val="0"/>
+          <w:numId w:val="19"/>
+        </w:numPr>
+      </w:pPr>
+      <w:r>
+        <w:t>price_at_booking: giá của từng ghế</w:t>
+      </w:r>
+    </w:p>
+    <w:p>
+      <w:pPr>
+        <w:pStyle w:val="ListParagraph"/>
+        <w:numPr>
           <w:ilvl w:val="1"/>
           <w:numId w:val="6"/>
         </w:numPr>
@@ -1093,7 +1236,20 @@
         </w:numPr>
       </w:pPr>
       <w:r>
+        <w:lastRenderedPageBreak/>
         <w:t>status: Trạng thái của phiên thanh toán (Ví dụ: SUCCESS - Thành công, FAILED - Thất bại).</w:t>
+      </w:r>
+    </w:p>
+    <w:p>
+      <w:pPr>
+        <w:pStyle w:val="ListParagraph"/>
+        <w:numPr>
+          <w:ilvl w:val="0"/>
+          <w:numId w:val="20"/>
+        </w:numPr>
+      </w:pPr>
+      <w:r>
+        <w:t>payment_time: thời gian thanh toán</w:t>
       </w:r>
     </w:p>
     <w:p>
@@ -1142,6 +1298,18 @@
         </w:numPr>
       </w:pPr>
       <w:r>
+        <w:t xml:space="preserve">description: mô tả </w:t>
+      </w:r>
+    </w:p>
+    <w:p>
+      <w:pPr>
+        <w:pStyle w:val="ListParagraph"/>
+        <w:numPr>
+          <w:ilvl w:val="0"/>
+          <w:numId w:val="21"/>
+        </w:numPr>
+      </w:pPr>
+      <w:r>
         <w:t>discount_type: Phân loại hình thức giảm giá (Giảm theo phần trăm hay giảm tiền mặt trực tiếp).</w:t>
       </w:r>
     </w:p>
@@ -1178,7 +1346,6 @@
         </w:numPr>
       </w:pPr>
       <w:r>
-        <w:lastRenderedPageBreak/>
         <w:t>max_discount_amount: Số tiền giảm tối đa (Áp dụng chặn trần cho loại giảm theo phần trăm).</w:t>
       </w:r>
     </w:p>
@@ -1228,6 +1395,15 @@
       </w:pPr>
       <w:r>
         <w:t>status: Trạng thái kích hoạt của mã giảm giá.</w:t>
+      </w:r>
+      <w:r>
+        <w:t xml:space="preserve"> (Enum: ACTIVE, EXPI</w:t>
+      </w:r>
+      <w:r>
+        <w:t>R</w:t>
+      </w:r>
+      <w:r>
+        <w:t>ED, DISABLED)</w:t>
       </w:r>
     </w:p>
     <w:p>
@@ -1497,6 +1673,7 @@
           <w:b/>
           <w:bCs/>
         </w:rPr>
+        <w:lastRenderedPageBreak/>
         <w:t>bookings (1) - (N) booking_details:</w:t>
       </w:r>
       <w:r>
@@ -1609,7 +1786,6 @@
         <w:pStyle w:val="Heading2"/>
       </w:pPr>
       <w:r>
-        <w:lastRenderedPageBreak/>
         <w:t>https://drawdb.vercel.app/editor/diagrams/54b06ebc-11d5-42cd-a6cb-bcd87c062426</w:t>
       </w:r>
       <w:r>
@@ -1798,6 +1974,7 @@
         </w:numPr>
       </w:pPr>
       <w:r>
+        <w:lastRenderedPageBreak/>
         <w:t>Khách hàng chọn phương thức thanh toán (Ví dụ: VNPay) và tiến hành xác nhận giao dịch.</w:t>
       </w:r>
     </w:p>
@@ -1859,7 +2036,6 @@
         </w:rPr>
       </w:pPr>
       <w:r>
-        <w:lastRenderedPageBreak/>
         <w:t>Quản trị viên tạo mã giảm giá mới</w:t>
       </w:r>
     </w:p>
@@ -2173,6 +2349,7 @@
           <w:b/>
           <w:bCs/>
         </w:rPr>
+        <w:lastRenderedPageBreak/>
         <w:t>Luồng sự kiện chính (Main Flow):</w:t>
       </w:r>
     </w:p>
@@ -2309,7 +2486,6 @@
         <w:ind w:left="1800"/>
       </w:pPr>
       <w:r>
-        <w:lastRenderedPageBreak/>
         <w:t>Hệ thống thông báo "Đăng ký thành công" và tự động chuyển hướng khách hàng sang trang Đăng nhập (hoặc tự động đăng nhập và cấp Token cho khách).</w:t>
       </w:r>
     </w:p>
@@ -2375,14 +2551,7 @@
           <w:b/>
           <w:bCs/>
         </w:rPr>
-        <w:t>K</w:t>
-      </w:r>
-      <w:r>
-        <w:rPr>
-          <w:b/>
-          <w:bCs/>
-        </w:rPr>
-        <w:t>ịch bản 4: đăng nhập và xác thực phân qu</w:t>
+        <w:t>Kịch bản 4: đăng nhập và xác thực phân qu</w:t>
       </w:r>
       <w:r>
         <w:rPr>
@@ -2601,6 +2770,7 @@
         <w:ind w:left="1800"/>
       </w:pPr>
       <w:r>
+        <w:lastRenderedPageBreak/>
         <w:t>Giao diện lưu trữ Token vào bộ nhớ trình duyệt (LocalStorage/Cookies) và tự động chuyển hướng người dùng dựa theo Quyền (Role):</w:t>
       </w:r>
     </w:p>
@@ -2719,7 +2889,6 @@
           <w:i/>
           <w:iCs/>
         </w:rPr>
-        <w:lastRenderedPageBreak/>
         <w:t>Ngoại lệ 2 (Bỏ trống trường dữ liệu):</w:t>
       </w:r>
       <w:r>
@@ -5013,7 +5182,7 @@
   <w:abstractNum w:abstractNumId="17" w15:restartNumberingAfterBreak="0">
     <w:nsid w:val="58753E0B"/>
     <w:multiLevelType w:val="multilevel"/>
-    <w:tmpl w:val="5D1ECE1C"/>
+    <w:tmpl w:val="11D6BC9A"/>
     <w:lvl w:ilvl="0">
       <w:start w:val="1"/>
       <w:numFmt w:val="decimal"/>
@@ -5024,6 +5193,8 @@
       </w:pPr>
       <w:rPr>
         <w:rFonts w:hint="default"/>
+        <w:b/>
+        <w:bCs/>
       </w:rPr>
     </w:lvl>
     <w:lvl w:ilvl="1">

</xml_diff>